<commit_message>
Carta v3 dirigida a Taylí Sánchez
Co-Authored-By: Claude Opus 5.5 <noreply@anthropic.com>
Claude-Session: https://claude.ai/code/session_01NeHkYtKpNTVMo5tPgtXgnp
</commit_message>
<xml_diff>
--- a/documentos-oficiales/carta-E-T-Cu-2026-001-sitio-nuevo-v3.docx
+++ b/documentos-oficiales/carta-E-T-Cu-2026-001-sitio-nuevo-v3.docx
@@ -356,7 +356,7 @@
                 <w:sz w:val="17"/>
                 <w:szCs w:val="17"/>
               </w:rPr>
-              <w:t xml:space="preserve">Abraham, desarrollo elTOQUE</w:t>
+              <w:t xml:space="preserve">Taylí Sánchez, elTOQUE</w:t>
             </w:r>
           </w:p>
           <w:p>
@@ -421,7 +421,7 @@
           <w:b/>
           <w:bCs/>
         </w:rPr>
-        <w:t xml:space="preserve">Abraham (GitHub: dogcalas)</w:t>
+        <w:t xml:space="preserve">Taylí Sánchez (GitHub: taylisanchez-085)</w:t>
       </w:r>
     </w:p>
     <w:p>
@@ -432,7 +432,7 @@
         <w:rPr>
           <w:rFonts w:ascii="Barlow" w:cs="Barlow" w:eastAsia="Barlow" w:hAnsi="Barlow"/>
         </w:rPr>
-        <w:t xml:space="preserve">Desarrollo, elTOQUE / Más Voces Foundation</w:t>
+        <w:t xml:space="preserve">elTOQUE / Más Voces Foundation</w:t>
       </w:r>
     </w:p>
     <w:p>
@@ -444,7 +444,7 @@
           <w:rFonts w:ascii="Barlow" w:cs="Barlow" w:eastAsia="Barlow" w:hAnsi="Barlow"/>
           <w:color w:val="5F6B80"/>
         </w:rPr>
-        <w:t xml:space="preserve">Copia: José Jasán Nieves y Taylí Sánchez (GitHub: taylisanchez-085)</w:t>
+        <w:t xml:space="preserve">Copia: Abraham, desarrollo (GitHub: dogcalas), y José Jasán Nieves</w:t>
       </w:r>
     </w:p>
     <w:p>
@@ -455,7 +455,7 @@
         <w:rPr>
           <w:rFonts w:ascii="Barlow" w:cs="Barlow" w:eastAsia="Barlow" w:hAnsi="Barlow"/>
         </w:rPr>
-        <w:t xml:space="preserve">Hola, Abraham:</w:t>
+        <w:t xml:space="preserve">Hola, Taylí:</w:t>
       </w:r>
     </w:p>
     <w:p>
@@ -466,7 +466,7 @@
         <w:rPr>
           <w:rFonts w:ascii="Barlow" w:cs="Barlow" w:eastAsia="Barlow" w:hAnsi="Barlow"/>
         </w:rPr>
-        <w:t xml:space="preserve">Como quedamos en la reunión del 12 de octubre, te escribo para orientarte en el sitio nuevo de ENTRE TODOS, que es donde irá el módulo, y para dejar por escrito cómo vamos a trabajar.</w:t>
+        <w:t xml:space="preserve">Como quedamos en la reunión del 12 de octubre, te escribo, a ti y a Abraham, para orientarlos en el sitio nuevo de ENTRE TODOS, que es donde irá el módulo, y para dejar por escrito cómo vamos a trabajar.</w:t>
       </w:r>
     </w:p>
     <w:p>
@@ -495,7 +495,7 @@
         <w:rPr>
           <w:rFonts w:ascii="Barlow" w:cs="Barlow" w:eastAsia="Barlow" w:hAnsi="Barlow"/>
         </w:rPr>
-        <w:t xml:space="preserve">Lo que vieron en entre-todos.org es la versión anterior. La versión nueva está terminando de construirse y la puedes ver en laxolingua.github.io/entre-todos-preview (todavía no es pública y tiene la votación desactivada). El código está en github.com/laxolingua/entre-todos: la rama rediseno-2026-10-14 tiene el código fuente y la rama main es el sitio publicado. El repositorio es público, así que ya pueden clonarlo y revisarlo; las instrucciones para compilarlo están en TRASPASO-2026-10-14.md.</w:t>
+        <w:t xml:space="preserve">Lo que vieron en entre-todos.org es la versión anterior. La versión nueva está terminando de construirse y la pueden ver en laxolingua.github.io/entre-todos-preview (todavía no es pública y tiene la votación desactivada). El código está en github.com/laxolingua/entre-todos: la rama rediseno-2026-10-14 tiene el código fuente y la rama main es el sitio publicado. El repositorio es público, así que ya pueden clonarlo y revisarlo; las instrucciones para compilarlo están en TRASPASO-2026-10-14.md.</w:t>
       </w:r>
     </w:p>
     <w:p>
@@ -747,7 +747,7 @@
         <w:rPr>
           <w:rFonts w:ascii="Barlow" w:cs="Barlow" w:eastAsia="Barlow" w:hAnsi="Barlow"/>
         </w:rPr>
-        <w:t xml:space="preserve">Quedó pendiente la pregunta de Taylí. Las fases separan las propuestas según el momento en que se aplicarían: la transición, el proceso constituyente y el gobierno ya elegido. Hay además unos mínimos que no se votan, porque se dan por hechos en cualquier paso a la democracia, como la liberación de los presos políticos y el respeto de los derechos humanos. Si les sirve, lo vemos con más detalle en la próxima reunión.</w:t>
+        <w:t xml:space="preserve">Quedó pendiente tu pregunta. Las fases separan las propuestas según el momento en que se aplicarían: la transición, el proceso constituyente y el gobierno ya elegido. Hay además unos mínimos que no se votan, porque se dan por hechos en cualquier paso a la democracia, como la liberación de los presos políticos y el respeto de los derechos humanos. Si les sirve, lo vemos con más detalle en la próxima reunión.</w:t>
       </w:r>
     </w:p>
     <w:p>

</xml_diff>